<commit_message>
feat: integrate Google Forms export
</commit_message>
<xml_diff>
--- a/ai-engine/template/template_ujian.docx
+++ b/ai-engine/template/template_ujian.docx
@@ -1540,7 +1540,19 @@
         <w:rPr>
           <w:rFonts w:asciiTheme="majorBidi" w:hAnsiTheme="majorBidi" w:cstheme="majorBidi"/>
         </w:rPr>
-        <w:t xml:space="preserve">}. </w:t>
+        <w:t>}.</w:t>
+      </w:r>
+      <w:r>
+        <w:rPr>
+          <w:rFonts w:asciiTheme="majorBidi" w:hAnsiTheme="majorBidi" w:cstheme="majorBidi"/>
+        </w:rPr>
+        <w:t xml:space="preserve"> </w:t>
+      </w:r>
+      <w:r>
+        <w:rPr>
+          <w:rFonts w:asciiTheme="majorBidi" w:hAnsiTheme="majorBidi" w:cstheme="majorBidi"/>
+        </w:rPr>
+        <w:t xml:space="preserve"> </w:t>
       </w:r>
       <w:proofErr w:type="gramStart"/>
       <w:r>
@@ -1996,7 +2008,19 @@
         <w:rPr>
           <w:rFonts w:asciiTheme="majorBidi" w:hAnsiTheme="majorBidi" w:cstheme="majorBidi"/>
         </w:rPr>
-        <w:t xml:space="preserve">}. </w:t>
+        <w:t>}.</w:t>
+      </w:r>
+      <w:r>
+        <w:rPr>
+          <w:rFonts w:asciiTheme="majorBidi" w:hAnsiTheme="majorBidi" w:cstheme="majorBidi"/>
+        </w:rPr>
+        <w:t xml:space="preserve"> </w:t>
+      </w:r>
+      <w:r>
+        <w:rPr>
+          <w:rFonts w:asciiTheme="majorBidi" w:hAnsiTheme="majorBidi" w:cstheme="majorBidi"/>
+        </w:rPr>
+        <w:t xml:space="preserve"> </w:t>
       </w:r>
       <w:proofErr w:type="gramStart"/>
       <w:r>
@@ -2335,6 +2359,12 @@
         </w:rPr>
         <w:t xml:space="preserve">}. </w:t>
       </w:r>
+      <w:r>
+        <w:rPr>
+          <w:rFonts w:asciiTheme="majorBidi" w:hAnsiTheme="majorBidi" w:cstheme="majorBidi"/>
+        </w:rPr>
+        <w:t xml:space="preserve"> </w:t>
+      </w:r>
       <w:proofErr w:type="gramStart"/>
       <w:r>
         <w:rPr>
@@ -2509,86 +2539,6 @@
         </w:rPr>
         <w:t>JAWAB:</w:t>
       </w:r>
-    </w:p>
-    <w:p>
-      <w:pPr>
-        <w:spacing w:after="0" w:line="360" w:lineRule="auto"/>
-        <w:rPr>
-          <w:rFonts w:asciiTheme="majorBidi" w:hAnsiTheme="majorBidi" w:cstheme="majorBidi"/>
-          <w:b/>
-          <w:bCs/>
-        </w:rPr>
-      </w:pPr>
-    </w:p>
-    <w:p>
-      <w:pPr>
-        <w:spacing w:after="0" w:line="360" w:lineRule="auto"/>
-        <w:rPr>
-          <w:rFonts w:asciiTheme="majorBidi" w:hAnsiTheme="majorBidi" w:cstheme="majorBidi"/>
-          <w:b/>
-          <w:bCs/>
-        </w:rPr>
-      </w:pPr>
-    </w:p>
-    <w:p>
-      <w:pPr>
-        <w:spacing w:after="0" w:line="360" w:lineRule="auto"/>
-        <w:rPr>
-          <w:rFonts w:asciiTheme="majorBidi" w:hAnsiTheme="majorBidi" w:cstheme="majorBidi"/>
-          <w:b/>
-          <w:bCs/>
-        </w:rPr>
-      </w:pPr>
-    </w:p>
-    <w:p>
-      <w:pPr>
-        <w:spacing w:after="0" w:line="360" w:lineRule="auto"/>
-        <w:rPr>
-          <w:rFonts w:asciiTheme="majorBidi" w:hAnsiTheme="majorBidi" w:cstheme="majorBidi"/>
-          <w:b/>
-          <w:bCs/>
-        </w:rPr>
-      </w:pPr>
-    </w:p>
-    <w:p>
-      <w:pPr>
-        <w:spacing w:after="0" w:line="360" w:lineRule="auto"/>
-        <w:rPr>
-          <w:rFonts w:asciiTheme="majorBidi" w:hAnsiTheme="majorBidi" w:cstheme="majorBidi"/>
-          <w:b/>
-          <w:bCs/>
-        </w:rPr>
-      </w:pPr>
-    </w:p>
-    <w:p>
-      <w:pPr>
-        <w:spacing w:after="0" w:line="360" w:lineRule="auto"/>
-        <w:rPr>
-          <w:rFonts w:asciiTheme="majorBidi" w:hAnsiTheme="majorBidi" w:cstheme="majorBidi"/>
-          <w:b/>
-          <w:bCs/>
-        </w:rPr>
-      </w:pPr>
-    </w:p>
-    <w:p>
-      <w:pPr>
-        <w:spacing w:after="0" w:line="360" w:lineRule="auto"/>
-        <w:rPr>
-          <w:rFonts w:asciiTheme="majorBidi" w:hAnsiTheme="majorBidi" w:cstheme="majorBidi"/>
-          <w:b/>
-          <w:bCs/>
-        </w:rPr>
-      </w:pPr>
-    </w:p>
-    <w:p>
-      <w:pPr>
-        <w:spacing w:after="0" w:line="360" w:lineRule="auto"/>
-        <w:rPr>
-          <w:rFonts w:asciiTheme="majorBidi" w:hAnsiTheme="majorBidi" w:cstheme="majorBidi"/>
-          <w:b/>
-          <w:bCs/>
-        </w:rPr>
-      </w:pPr>
     </w:p>
     <w:p>
       <w:pPr>
@@ -3081,7 +3031,6 @@
                 <w:noProof/>
                 <w:sz w:val="32"/>
               </w:rPr>
-              <w:lastRenderedPageBreak/>
               <w:drawing>
                 <wp:inline distT="0" distB="0" distL="0" distR="0" wp14:anchorId="45E723AB" wp14:editId="4F501F5A">
                   <wp:extent cx="1310268" cy="895350"/>
@@ -3445,6 +3394,26 @@
           <w:rFonts w:asciiTheme="majorBidi" w:hAnsiTheme="majorBidi" w:cstheme="majorBidi"/>
         </w:rPr>
       </w:pPr>
+      <w:r>
+        <w:rPr>
+          <w:rFonts w:asciiTheme="majorBidi" w:hAnsiTheme="majorBidi" w:cstheme="majorBidi"/>
+        </w:rPr>
+        <w:t xml:space="preserve">{%p if </w:t>
+      </w:r>
+      <w:proofErr w:type="spellStart"/>
+      <w:r>
+        <w:rPr>
+          <w:rFonts w:asciiTheme="majorBidi" w:hAnsiTheme="majorBidi" w:cstheme="majorBidi"/>
+        </w:rPr>
+        <w:t>pg_list|length</w:t>
+      </w:r>
+      <w:proofErr w:type="spellEnd"/>
+      <w:r>
+        <w:rPr>
+          <w:rFonts w:asciiTheme="majorBidi" w:hAnsiTheme="majorBidi" w:cstheme="majorBidi"/>
+        </w:rPr>
+        <w:t xml:space="preserve"> &gt; 0 %}</w:t>
+      </w:r>
     </w:p>
     <w:p>
       <w:pPr>
@@ -3456,37 +3425,10 @@
       <w:r>
         <w:rPr>
           <w:rFonts w:asciiTheme="majorBidi" w:hAnsiTheme="majorBidi" w:cstheme="majorBidi"/>
-        </w:rPr>
-        <w:t xml:space="preserve">{%p if </w:t>
-      </w:r>
-      <w:proofErr w:type="spellStart"/>
-      <w:r>
-        <w:rPr>
-          <w:rFonts w:asciiTheme="majorBidi" w:hAnsiTheme="majorBidi" w:cstheme="majorBidi"/>
-        </w:rPr>
-        <w:t>pg_list|length</w:t>
-      </w:r>
-      <w:proofErr w:type="spellEnd"/>
-      <w:r>
-        <w:rPr>
-          <w:rFonts w:asciiTheme="majorBidi" w:hAnsiTheme="majorBidi" w:cstheme="majorBidi"/>
-        </w:rPr>
-        <w:t xml:space="preserve"> &gt; 0 %}</w:t>
-      </w:r>
-    </w:p>
-    <w:p>
-      <w:pPr>
-        <w:spacing w:after="0" w:line="360" w:lineRule="auto"/>
-        <w:rPr>
-          <w:rFonts w:asciiTheme="majorBidi" w:hAnsiTheme="majorBidi" w:cstheme="majorBidi"/>
-        </w:rPr>
-      </w:pPr>
-      <w:r>
-        <w:rPr>
-          <w:rFonts w:asciiTheme="majorBidi" w:hAnsiTheme="majorBidi" w:cstheme="majorBidi"/>
           <w:b/>
           <w:bCs/>
         </w:rPr>
+        <w:lastRenderedPageBreak/>
         <w:pict w14:anchorId="699FC7C9">
           <v:rect id="_x0000_i1036" style="width:0;height:1.5pt" o:hralign="center" o:hrstd="t" o:hr="t" fillcolor="#a0a0a0" stroked="f"/>
         </w:pict>
@@ -3541,14 +3483,20 @@
     <w:p>
       <w:pPr>
         <w:spacing w:after="0" w:line="360" w:lineRule="auto"/>
-        <w:rPr>
-          <w:rFonts w:asciiTheme="majorBidi" w:hAnsiTheme="majorBidi" w:cstheme="majorBidi"/>
+        <w:ind w:left="284" w:hanging="284"/>
+        <w:jc w:val="both"/>
+        <w:rPr>
+          <w:rFonts w:asciiTheme="majorBidi" w:hAnsiTheme="majorBidi" w:cstheme="majorBidi"/>
+          <w:b/>
+          <w:bCs/>
         </w:rPr>
       </w:pPr>
       <w:proofErr w:type="gramStart"/>
       <w:r>
         <w:rPr>
           <w:rFonts w:asciiTheme="majorBidi" w:hAnsiTheme="majorBidi" w:cstheme="majorBidi"/>
+          <w:b/>
+          <w:bCs/>
         </w:rPr>
         <w:t xml:space="preserve">{{ </w:t>
       </w:r>
@@ -3556,6 +3504,8 @@
       <w:r>
         <w:rPr>
           <w:rFonts w:asciiTheme="majorBidi" w:hAnsiTheme="majorBidi" w:cstheme="majorBidi"/>
+          <w:b/>
+          <w:bCs/>
         </w:rPr>
         <w:t>s</w:t>
       </w:r>
@@ -3563,6 +3513,8 @@
       <w:r>
         <w:rPr>
           <w:rFonts w:asciiTheme="majorBidi" w:hAnsiTheme="majorBidi" w:cstheme="majorBidi"/>
+          <w:b/>
+          <w:bCs/>
         </w:rPr>
         <w:t>.</w:t>
       </w:r>
@@ -3570,6 +3522,8 @@
       <w:r>
         <w:rPr>
           <w:rFonts w:asciiTheme="majorBidi" w:hAnsiTheme="majorBidi" w:cstheme="majorBidi"/>
+          <w:b/>
+          <w:bCs/>
         </w:rPr>
         <w:t>nomor</w:t>
       </w:r>
@@ -3577,6 +3531,8 @@
       <w:r>
         <w:rPr>
           <w:rFonts w:asciiTheme="majorBidi" w:hAnsiTheme="majorBidi" w:cstheme="majorBidi"/>
+          <w:b/>
+          <w:bCs/>
         </w:rPr>
         <w:t xml:space="preserve"> }</w:t>
       </w:r>
@@ -3584,13 +3540,25 @@
       <w:r>
         <w:rPr>
           <w:rFonts w:asciiTheme="majorBidi" w:hAnsiTheme="majorBidi" w:cstheme="majorBidi"/>
+          <w:b/>
+          <w:bCs/>
         </w:rPr>
         <w:t xml:space="preserve">}. </w:t>
       </w:r>
+      <w:r>
+        <w:rPr>
+          <w:rFonts w:asciiTheme="majorBidi" w:hAnsiTheme="majorBidi" w:cstheme="majorBidi"/>
+          <w:b/>
+          <w:bCs/>
+        </w:rPr>
+        <w:t xml:space="preserve"> </w:t>
+      </w:r>
       <w:proofErr w:type="spellStart"/>
       <w:r>
         <w:rPr>
           <w:rFonts w:asciiTheme="majorBidi" w:hAnsiTheme="majorBidi" w:cstheme="majorBidi"/>
+          <w:b/>
+          <w:bCs/>
         </w:rPr>
         <w:t>Jawaban</w:t>
       </w:r>
@@ -3598,6 +3566,8 @@
       <w:r>
         <w:rPr>
           <w:rFonts w:asciiTheme="majorBidi" w:hAnsiTheme="majorBidi" w:cstheme="majorBidi"/>
+          <w:b/>
+          <w:bCs/>
         </w:rPr>
         <w:t xml:space="preserve">: </w:t>
       </w:r>
@@ -3605,6 +3575,8 @@
       <w:r>
         <w:rPr>
           <w:rFonts w:asciiTheme="majorBidi" w:hAnsiTheme="majorBidi" w:cstheme="majorBidi"/>
+          <w:b/>
+          <w:bCs/>
         </w:rPr>
         <w:t xml:space="preserve">{{ </w:t>
       </w:r>
@@ -3612,6 +3584,8 @@
       <w:r>
         <w:rPr>
           <w:rFonts w:asciiTheme="majorBidi" w:hAnsiTheme="majorBidi" w:cstheme="majorBidi"/>
+          <w:b/>
+          <w:bCs/>
         </w:rPr>
         <w:t>s</w:t>
       </w:r>
@@ -3619,6 +3593,8 @@
       <w:r>
         <w:rPr>
           <w:rFonts w:asciiTheme="majorBidi" w:hAnsiTheme="majorBidi" w:cstheme="majorBidi"/>
+          <w:b/>
+          <w:bCs/>
         </w:rPr>
         <w:t>.</w:t>
       </w:r>
@@ -3626,6 +3602,8 @@
       <w:r>
         <w:rPr>
           <w:rFonts w:asciiTheme="majorBidi" w:hAnsiTheme="majorBidi" w:cstheme="majorBidi"/>
+          <w:b/>
+          <w:bCs/>
         </w:rPr>
         <w:t>jawaban</w:t>
       </w:r>
@@ -3633,6 +3611,8 @@
       <w:r>
         <w:rPr>
           <w:rFonts w:asciiTheme="majorBidi" w:hAnsiTheme="majorBidi" w:cstheme="majorBidi"/>
+          <w:b/>
+          <w:bCs/>
         </w:rPr>
         <w:t xml:space="preserve"> }</w:t>
       </w:r>
@@ -3640,6 +3620,8 @@
       <w:r>
         <w:rPr>
           <w:rFonts w:asciiTheme="majorBidi" w:hAnsiTheme="majorBidi" w:cstheme="majorBidi"/>
+          <w:b/>
+          <w:bCs/>
         </w:rPr>
         <w:t>}</w:t>
       </w:r>
@@ -3675,20 +3657,18 @@
     <w:p>
       <w:pPr>
         <w:spacing w:after="0" w:line="360" w:lineRule="auto"/>
-        <w:rPr>
-          <w:rFonts w:asciiTheme="majorBidi" w:hAnsiTheme="majorBidi" w:cstheme="majorBidi"/>
-        </w:rPr>
-      </w:pPr>
-      <w:r>
-        <w:rPr>
-          <w:rFonts w:asciiTheme="majorBidi" w:hAnsiTheme="majorBidi" w:cstheme="majorBidi"/>
-        </w:rPr>
-        <w:t xml:space="preserve">   </w:t>
-      </w:r>
+        <w:ind w:left="284"/>
+        <w:jc w:val="both"/>
+        <w:rPr>
+          <w:rFonts w:asciiTheme="majorBidi" w:hAnsiTheme="majorBidi" w:cstheme="majorBidi"/>
+        </w:rPr>
+      </w:pPr>
       <w:proofErr w:type="spellStart"/>
       <w:r>
         <w:rPr>
           <w:rFonts w:asciiTheme="majorBidi" w:hAnsiTheme="majorBidi" w:cstheme="majorBidi"/>
+          <w:b/>
+          <w:bCs/>
         </w:rPr>
         <w:t>Pembahasan</w:t>
       </w:r>
@@ -3696,8 +3676,16 @@
       <w:r>
         <w:rPr>
           <w:rFonts w:asciiTheme="majorBidi" w:hAnsiTheme="majorBidi" w:cstheme="majorBidi"/>
-        </w:rPr>
-        <w:t xml:space="preserve">: </w:t>
+          <w:b/>
+          <w:bCs/>
+        </w:rPr>
+        <w:t>:</w:t>
+      </w:r>
+      <w:r>
+        <w:rPr>
+          <w:rFonts w:asciiTheme="majorBidi" w:hAnsiTheme="majorBidi" w:cstheme="majorBidi"/>
+        </w:rPr>
+        <w:t xml:space="preserve"> </w:t>
       </w:r>
       <w:proofErr w:type="gramStart"/>
       <w:r>
@@ -3917,6 +3905,8 @@
       <w:r>
         <w:rPr>
           <w:rFonts w:asciiTheme="majorBidi" w:hAnsiTheme="majorBidi" w:cstheme="majorBidi"/>
+          <w:b/>
+          <w:bCs/>
         </w:rPr>
         <w:t xml:space="preserve">{{ </w:t>
       </w:r>
@@ -3924,6 +3914,8 @@
       <w:r>
         <w:rPr>
           <w:rFonts w:asciiTheme="majorBidi" w:hAnsiTheme="majorBidi" w:cstheme="majorBidi"/>
+          <w:b/>
+          <w:bCs/>
         </w:rPr>
         <w:t>s</w:t>
       </w:r>
@@ -3931,6 +3923,8 @@
       <w:r>
         <w:rPr>
           <w:rFonts w:asciiTheme="majorBidi" w:hAnsiTheme="majorBidi" w:cstheme="majorBidi"/>
+          <w:b/>
+          <w:bCs/>
         </w:rPr>
         <w:t>.</w:t>
       </w:r>
@@ -3938,6 +3932,8 @@
       <w:r>
         <w:rPr>
           <w:rFonts w:asciiTheme="majorBidi" w:hAnsiTheme="majorBidi" w:cstheme="majorBidi"/>
+          <w:b/>
+          <w:bCs/>
         </w:rPr>
         <w:t>nomor</w:t>
       </w:r>
@@ -3945,6 +3941,8 @@
       <w:r>
         <w:rPr>
           <w:rFonts w:asciiTheme="majorBidi" w:hAnsiTheme="majorBidi" w:cstheme="majorBidi"/>
+          <w:b/>
+          <w:bCs/>
         </w:rPr>
         <w:t xml:space="preserve"> }</w:t>
       </w:r>
@@ -3952,13 +3950,29 @@
       <w:r>
         <w:rPr>
           <w:rFonts w:asciiTheme="majorBidi" w:hAnsiTheme="majorBidi" w:cstheme="majorBidi"/>
-        </w:rPr>
-        <w:t xml:space="preserve">}. </w:t>
+          <w:b/>
+          <w:bCs/>
+        </w:rPr>
+        <w:t>}.</w:t>
+      </w:r>
+      <w:r>
+        <w:rPr>
+          <w:rFonts w:asciiTheme="majorBidi" w:hAnsiTheme="majorBidi" w:cstheme="majorBidi"/>
+        </w:rPr>
+        <w:t xml:space="preserve"> </w:t>
+      </w:r>
+      <w:r>
+        <w:rPr>
+          <w:rFonts w:asciiTheme="majorBidi" w:hAnsiTheme="majorBidi" w:cstheme="majorBidi"/>
+        </w:rPr>
+        <w:t xml:space="preserve"> </w:t>
       </w:r>
       <w:proofErr w:type="spellStart"/>
       <w:r>
         <w:rPr>
           <w:rFonts w:asciiTheme="majorBidi" w:hAnsiTheme="majorBidi" w:cstheme="majorBidi"/>
+          <w:b/>
+          <w:bCs/>
         </w:rPr>
         <w:t>Jawaban</w:t>
       </w:r>
@@ -3966,8 +3980,16 @@
       <w:r>
         <w:rPr>
           <w:rFonts w:asciiTheme="majorBidi" w:hAnsiTheme="majorBidi" w:cstheme="majorBidi"/>
-        </w:rPr>
-        <w:t xml:space="preserve">: </w:t>
+          <w:b/>
+          <w:bCs/>
+        </w:rPr>
+        <w:t>:</w:t>
+      </w:r>
+      <w:r>
+        <w:rPr>
+          <w:rFonts w:asciiTheme="majorBidi" w:hAnsiTheme="majorBidi" w:cstheme="majorBidi"/>
+        </w:rPr>
+        <w:t xml:space="preserve"> </w:t>
       </w:r>
       <w:proofErr w:type="gramStart"/>
       <w:r>
@@ -4047,16 +4069,22 @@
           <w:rFonts w:asciiTheme="majorBidi" w:hAnsiTheme="majorBidi" w:cstheme="majorBidi"/>
         </w:rPr>
       </w:pPr>
-      <w:r>
-        <w:rPr>
-          <w:rFonts w:asciiTheme="majorBidi" w:hAnsiTheme="majorBidi" w:cstheme="majorBidi"/>
-        </w:rPr>
-        <w:t xml:space="preserve">   </w:t>
-      </w:r>
+    </w:p>
+    <w:p>
+      <w:pPr>
+        <w:spacing w:after="0" w:line="360" w:lineRule="auto"/>
+        <w:ind w:left="142"/>
+        <w:jc w:val="both"/>
+        <w:rPr>
+          <w:rFonts w:asciiTheme="majorBidi" w:hAnsiTheme="majorBidi" w:cstheme="majorBidi"/>
+        </w:rPr>
+      </w:pPr>
       <w:proofErr w:type="spellStart"/>
       <w:r>
         <w:rPr>
           <w:rFonts w:asciiTheme="majorBidi" w:hAnsiTheme="majorBidi" w:cstheme="majorBidi"/>
+          <w:b/>
+          <w:bCs/>
         </w:rPr>
         <w:t>Pembahasan</w:t>
       </w:r>
@@ -4064,8 +4092,16 @@
       <w:r>
         <w:rPr>
           <w:rFonts w:asciiTheme="majorBidi" w:hAnsiTheme="majorBidi" w:cstheme="majorBidi"/>
-        </w:rPr>
-        <w:t xml:space="preserve">: </w:t>
+          <w:b/>
+          <w:bCs/>
+        </w:rPr>
+        <w:t>:</w:t>
+      </w:r>
+      <w:r>
+        <w:rPr>
+          <w:rFonts w:asciiTheme="majorBidi" w:hAnsiTheme="majorBidi" w:cstheme="majorBidi"/>
+        </w:rPr>
+        <w:t xml:space="preserve"> </w:t>
       </w:r>
       <w:proofErr w:type="gramStart"/>
       <w:r>
@@ -4243,7 +4279,6 @@
           <w:b/>
           <w:bCs/>
         </w:rPr>
-        <w:lastRenderedPageBreak/>
         <w:t>III. ESSAY</w:t>
       </w:r>
     </w:p>
@@ -4278,6 +4313,8 @@
     <w:p>
       <w:pPr>
         <w:spacing w:after="0" w:line="360" w:lineRule="auto"/>
+        <w:ind w:left="284" w:hanging="284"/>
+        <w:jc w:val="both"/>
         <w:rPr>
           <w:rFonts w:asciiTheme="majorBidi" w:hAnsiTheme="majorBidi" w:cstheme="majorBidi"/>
         </w:rPr>
@@ -4286,6 +4323,8 @@
       <w:r>
         <w:rPr>
           <w:rFonts w:asciiTheme="majorBidi" w:hAnsiTheme="majorBidi" w:cstheme="majorBidi"/>
+          <w:b/>
+          <w:bCs/>
         </w:rPr>
         <w:t xml:space="preserve">{{ </w:t>
       </w:r>
@@ -4293,6 +4332,8 @@
       <w:r>
         <w:rPr>
           <w:rFonts w:asciiTheme="majorBidi" w:hAnsiTheme="majorBidi" w:cstheme="majorBidi"/>
+          <w:b/>
+          <w:bCs/>
         </w:rPr>
         <w:t>s</w:t>
       </w:r>
@@ -4300,6 +4341,8 @@
       <w:r>
         <w:rPr>
           <w:rFonts w:asciiTheme="majorBidi" w:hAnsiTheme="majorBidi" w:cstheme="majorBidi"/>
+          <w:b/>
+          <w:bCs/>
         </w:rPr>
         <w:t>.</w:t>
       </w:r>
@@ -4307,6 +4350,8 @@
       <w:r>
         <w:rPr>
           <w:rFonts w:asciiTheme="majorBidi" w:hAnsiTheme="majorBidi" w:cstheme="majorBidi"/>
+          <w:b/>
+          <w:bCs/>
         </w:rPr>
         <w:t>nomor</w:t>
       </w:r>
@@ -4314,6 +4359,8 @@
       <w:r>
         <w:rPr>
           <w:rFonts w:asciiTheme="majorBidi" w:hAnsiTheme="majorBidi" w:cstheme="majorBidi"/>
+          <w:b/>
+          <w:bCs/>
         </w:rPr>
         <w:t xml:space="preserve"> }</w:t>
       </w:r>
@@ -4321,13 +4368,29 @@
       <w:r>
         <w:rPr>
           <w:rFonts w:asciiTheme="majorBidi" w:hAnsiTheme="majorBidi" w:cstheme="majorBidi"/>
-        </w:rPr>
-        <w:t xml:space="preserve">}. </w:t>
+          <w:b/>
+          <w:bCs/>
+        </w:rPr>
+        <w:t>}.</w:t>
+      </w:r>
+      <w:r>
+        <w:rPr>
+          <w:rFonts w:asciiTheme="majorBidi" w:hAnsiTheme="majorBidi" w:cstheme="majorBidi"/>
+        </w:rPr>
+        <w:t xml:space="preserve"> </w:t>
+      </w:r>
+      <w:r>
+        <w:rPr>
+          <w:rFonts w:asciiTheme="majorBidi" w:hAnsiTheme="majorBidi" w:cstheme="majorBidi"/>
+        </w:rPr>
+        <w:t xml:space="preserve"> </w:t>
       </w:r>
       <w:proofErr w:type="spellStart"/>
       <w:r>
         <w:rPr>
           <w:rFonts w:asciiTheme="majorBidi" w:hAnsiTheme="majorBidi" w:cstheme="majorBidi"/>
+          <w:b/>
+          <w:bCs/>
         </w:rPr>
         <w:t>Jawaban</w:t>
       </w:r>
@@ -4335,8 +4398,16 @@
       <w:r>
         <w:rPr>
           <w:rFonts w:asciiTheme="majorBidi" w:hAnsiTheme="majorBidi" w:cstheme="majorBidi"/>
-        </w:rPr>
-        <w:t xml:space="preserve">: </w:t>
+          <w:b/>
+          <w:bCs/>
+        </w:rPr>
+        <w:t>:</w:t>
+      </w:r>
+      <w:r>
+        <w:rPr>
+          <w:rFonts w:asciiTheme="majorBidi" w:hAnsiTheme="majorBidi" w:cstheme="majorBidi"/>
+        </w:rPr>
+        <w:t xml:space="preserve"> </w:t>
       </w:r>
       <w:proofErr w:type="gramStart"/>
       <w:r>
@@ -4416,81 +4487,81 @@
           <w:rFonts w:asciiTheme="majorBidi" w:hAnsiTheme="majorBidi" w:cstheme="majorBidi"/>
         </w:rPr>
       </w:pPr>
-      <w:r>
-        <w:rPr>
-          <w:rFonts w:asciiTheme="majorBidi" w:hAnsiTheme="majorBidi" w:cstheme="majorBidi"/>
-        </w:rPr>
-        <w:t xml:space="preserve">   </w:t>
-      </w:r>
-      <w:proofErr w:type="spellStart"/>
-      <w:r>
-        <w:rPr>
-          <w:rFonts w:asciiTheme="majorBidi" w:hAnsiTheme="majorBidi" w:cstheme="majorBidi"/>
-        </w:rPr>
-        <w:t>Pembahasan</w:t>
-      </w:r>
-      <w:proofErr w:type="spellEnd"/>
-      <w:r>
-        <w:rPr>
-          <w:rFonts w:asciiTheme="majorBidi" w:hAnsiTheme="majorBidi" w:cstheme="majorBidi"/>
-        </w:rPr>
-        <w:t xml:space="preserve">: </w:t>
-      </w:r>
-      <w:proofErr w:type="gramStart"/>
-      <w:r>
-        <w:rPr>
-          <w:rFonts w:asciiTheme="majorBidi" w:hAnsiTheme="majorBidi" w:cstheme="majorBidi"/>
-        </w:rPr>
-        <w:t xml:space="preserve">{{ </w:t>
-      </w:r>
-      <w:proofErr w:type="spellStart"/>
-      <w:r>
-        <w:rPr>
-          <w:rFonts w:asciiTheme="majorBidi" w:hAnsiTheme="majorBidi" w:cstheme="majorBidi"/>
-        </w:rPr>
-        <w:t>s</w:t>
-      </w:r>
-      <w:proofErr w:type="gramEnd"/>
-      <w:r>
-        <w:rPr>
-          <w:rFonts w:asciiTheme="majorBidi" w:hAnsiTheme="majorBidi" w:cstheme="majorBidi"/>
-        </w:rPr>
-        <w:t>.</w:t>
-      </w:r>
-      <w:proofErr w:type="gramStart"/>
-      <w:r>
-        <w:rPr>
-          <w:rFonts w:asciiTheme="majorBidi" w:hAnsiTheme="majorBidi" w:cstheme="majorBidi"/>
-        </w:rPr>
-        <w:t>pembahasan</w:t>
-      </w:r>
-      <w:proofErr w:type="spellEnd"/>
-      <w:r>
-        <w:rPr>
-          <w:rFonts w:asciiTheme="majorBidi" w:hAnsiTheme="majorBidi" w:cstheme="majorBidi"/>
-        </w:rPr>
-        <w:t xml:space="preserve"> }</w:t>
-      </w:r>
-      <w:proofErr w:type="gramEnd"/>
-      <w:r>
-        <w:rPr>
-          <w:rFonts w:asciiTheme="majorBidi" w:hAnsiTheme="majorBidi" w:cstheme="majorBidi"/>
-        </w:rPr>
-        <w:t>}</w:t>
-      </w:r>
     </w:p>
     <w:p>
       <w:pPr>
         <w:spacing w:after="0" w:line="360" w:lineRule="auto"/>
-        <w:rPr>
-          <w:rFonts w:asciiTheme="majorBidi" w:hAnsiTheme="majorBidi" w:cstheme="majorBidi"/>
-        </w:rPr>
-      </w:pPr>
-      <w:r>
-        <w:rPr>
-          <w:rFonts w:asciiTheme="majorBidi" w:hAnsiTheme="majorBidi" w:cstheme="majorBidi"/>
-        </w:rPr>
-        <w:t>{%p endif %}</w:t>
+        <w:ind w:left="284"/>
+        <w:jc w:val="both"/>
+        <w:rPr>
+          <w:rFonts w:asciiTheme="majorBidi" w:hAnsiTheme="majorBidi" w:cstheme="majorBidi"/>
+        </w:rPr>
+      </w:pPr>
+      <w:proofErr w:type="spellStart"/>
+      <w:r>
+        <w:rPr>
+          <w:rFonts w:asciiTheme="majorBidi" w:hAnsiTheme="majorBidi" w:cstheme="majorBidi"/>
+          <w:b/>
+          <w:bCs/>
+        </w:rPr>
+        <w:t>Pembahasan</w:t>
+      </w:r>
+      <w:proofErr w:type="spellEnd"/>
+      <w:r>
+        <w:rPr>
+          <w:rFonts w:asciiTheme="majorBidi" w:hAnsiTheme="majorBidi" w:cstheme="majorBidi"/>
+          <w:b/>
+          <w:bCs/>
+        </w:rPr>
+        <w:t>:</w:t>
+      </w:r>
+      <w:r>
+        <w:rPr>
+          <w:rFonts w:asciiTheme="majorBidi" w:hAnsiTheme="majorBidi" w:cstheme="majorBidi"/>
+        </w:rPr>
+        <w:t xml:space="preserve"> </w:t>
+      </w:r>
+      <w:proofErr w:type="gramStart"/>
+      <w:r>
+        <w:rPr>
+          <w:rFonts w:asciiTheme="majorBidi" w:hAnsiTheme="majorBidi" w:cstheme="majorBidi"/>
+        </w:rPr>
+        <w:t xml:space="preserve">{{ </w:t>
+      </w:r>
+      <w:proofErr w:type="spellStart"/>
+      <w:r>
+        <w:rPr>
+          <w:rFonts w:asciiTheme="majorBidi" w:hAnsiTheme="majorBidi" w:cstheme="majorBidi"/>
+        </w:rPr>
+        <w:t>s</w:t>
+      </w:r>
+      <w:proofErr w:type="gramEnd"/>
+      <w:r>
+        <w:rPr>
+          <w:rFonts w:asciiTheme="majorBidi" w:hAnsiTheme="majorBidi" w:cstheme="majorBidi"/>
+        </w:rPr>
+        <w:t>.</w:t>
+      </w:r>
+      <w:proofErr w:type="gramStart"/>
+      <w:r>
+        <w:rPr>
+          <w:rFonts w:asciiTheme="majorBidi" w:hAnsiTheme="majorBidi" w:cstheme="majorBidi"/>
+        </w:rPr>
+        <w:t>pembahasan</w:t>
+      </w:r>
+      <w:proofErr w:type="spellEnd"/>
+      <w:r>
+        <w:rPr>
+          <w:rFonts w:asciiTheme="majorBidi" w:hAnsiTheme="majorBidi" w:cstheme="majorBidi"/>
+        </w:rPr>
+        <w:t xml:space="preserve"> }</w:t>
+      </w:r>
+      <w:proofErr w:type="gramEnd"/>
+      <w:r>
+        <w:rPr>
+          <w:rFonts w:asciiTheme="majorBidi" w:hAnsiTheme="majorBidi" w:cstheme="majorBidi"/>
+        </w:rPr>
+        <w:t>}</w:t>
       </w:r>
     </w:p>
     <w:p>
@@ -4500,6 +4571,12 @@
           <w:rFonts w:asciiTheme="majorBidi" w:hAnsiTheme="majorBidi" w:cstheme="majorBidi"/>
         </w:rPr>
       </w:pPr>
+      <w:r>
+        <w:rPr>
+          <w:rFonts w:asciiTheme="majorBidi" w:hAnsiTheme="majorBidi" w:cstheme="majorBidi"/>
+        </w:rPr>
+        <w:t>{%p endif %}</w:t>
+      </w:r>
     </w:p>
     <w:p>
       <w:pPr>
@@ -4508,10 +4585,19 @@
           <w:rFonts w:asciiTheme="majorBidi" w:hAnsiTheme="majorBidi" w:cstheme="majorBidi"/>
         </w:rPr>
       </w:pPr>
-      <w:r>
-        <w:rPr>
-          <w:rFonts w:asciiTheme="majorBidi" w:hAnsiTheme="majorBidi" w:cstheme="majorBidi"/>
-        </w:rPr>
+    </w:p>
+    <w:p>
+      <w:pPr>
+        <w:spacing w:after="0" w:line="360" w:lineRule="auto"/>
+        <w:rPr>
+          <w:rFonts w:asciiTheme="majorBidi" w:hAnsiTheme="majorBidi" w:cstheme="majorBidi"/>
+        </w:rPr>
+      </w:pPr>
+      <w:r>
+        <w:rPr>
+          <w:rFonts w:asciiTheme="majorBidi" w:hAnsiTheme="majorBidi" w:cstheme="majorBidi"/>
+        </w:rPr>
+        <w:lastRenderedPageBreak/>
         <w:t xml:space="preserve">{%p </w:t>
       </w:r>
       <w:proofErr w:type="spellStart"/>
@@ -4527,6 +4613,20 @@
           <w:rFonts w:asciiTheme="majorBidi" w:hAnsiTheme="majorBidi" w:cstheme="majorBidi"/>
         </w:rPr>
         <w:t xml:space="preserve"> %}</w:t>
+      </w:r>
+    </w:p>
+    <w:p>
+      <w:pPr>
+        <w:spacing w:after="0" w:line="360" w:lineRule="auto"/>
+        <w:rPr>
+          <w:rFonts w:asciiTheme="majorBidi" w:hAnsiTheme="majorBidi" w:cstheme="majorBidi"/>
+        </w:rPr>
+      </w:pPr>
+      <w:r>
+        <w:rPr>
+          <w:rFonts w:asciiTheme="majorBidi" w:hAnsiTheme="majorBidi" w:cstheme="majorBidi"/>
+        </w:rPr>
+        <w:t>{%p endif %}</w:t>
       </w:r>
     </w:p>
     <w:p>
@@ -5545,7 +5645,6 @@
   <w:style w:type="character" w:default="1" w:styleId="DefaultParagraphFont">
     <w:name w:val="Default Paragraph Font"/>
     <w:uiPriority w:val="1"/>
-    <w:semiHidden/>
     <w:unhideWhenUsed/>
   </w:style>
   <w:style w:type="table" w:default="1" w:styleId="TableNormal">

</xml_diff>